<commit_message>
Unify final seed and docx styling
</commit_message>
<xml_diff>
--- a/report_final.docx
+++ b/report_final.docx
@@ -9,9 +9,9 @@
       </w:pPr>
       <w:r>
         <w:rPr>
-          <w:rFonts w:ascii="Microsoft YaHei" w:hAnsi="Microsoft YaHei" w:eastAsia="Microsoft YaHei"/>
+          <w:rFonts w:ascii="SimSun" w:hAnsi="SimSun" w:eastAsia="SimSun"/>
           <w:b/>
-          <w:color w:val="1F4E79"/>
+          <w:color w:val="000000"/>
           <w:sz w:val="40"/>
         </w:rPr>
         <w:t>人工智能基础及应用大作业 3 报告</w:t>
@@ -24,8 +24,8 @@
       </w:pPr>
       <w:r>
         <w:rPr>
-          <w:rFonts w:ascii="Microsoft YaHei" w:hAnsi="Microsoft YaHei" w:eastAsia="Microsoft YaHei"/>
-          <w:color w:val="5A5A5A"/>
+          <w:rFonts w:ascii="SimSun" w:hAnsi="SimSun" w:eastAsia="SimSun"/>
+          <w:color w:val="000000"/>
           <w:sz w:val="21"/>
         </w:rPr>
         <w:t>Humanoid-v5 强化学习训练与评估</w:t>
@@ -44,7 +44,7 @@
     <w:p>
       <w:r>
         <w:rPr>
-          <w:rFonts w:ascii="Microsoft YaHei" w:hAnsi="Microsoft YaHei" w:eastAsia="Microsoft YaHei"/>
+          <w:rFonts w:ascii="SimSun" w:hAnsi="SimSun" w:eastAsia="SimSun"/>
           <w:b w:val="0"/>
         </w:rPr>
         <w:t xml:space="preserve">本次作业要求在 Gymnasium MuJoCo </w:t>
@@ -53,14 +53,14 @@
         <w:rPr>
           <w:rFonts w:ascii="Consolas" w:hAnsi="Consolas" w:eastAsia="Consolas"/>
           <w:b w:val="0"/>
-          <w:color w:val="282828"/>
+          <w:color w:val="000000"/>
           <w:sz w:val="19"/>
         </w:rPr>
         <w:t>Humanoid-v5</w:t>
       </w:r>
       <w:r>
         <w:rPr>
-          <w:rFonts w:ascii="Microsoft YaHei" w:hAnsi="Microsoft YaHei" w:eastAsia="Microsoft YaHei"/>
+          <w:rFonts w:ascii="SimSun" w:hAnsi="SimSun" w:eastAsia="SimSun"/>
           <w:b w:val="0"/>
         </w:rPr>
         <w:t xml:space="preserve"> 环境中训练强化学习智能体，使三维人形机器人在保持平衡的同时尽可能向前移动。该任务属于高维连续控制问题：智能体需要根据身体姿态、速度、关节状态和外力等观测信息，输出连续动作来控制多个关节。</w:t>
@@ -70,7 +70,7 @@
     <w:p>
       <w:r>
         <w:rPr>
-          <w:rFonts w:ascii="Microsoft YaHei" w:hAnsi="Microsoft YaHei" w:eastAsia="Microsoft YaHei"/>
+          <w:rFonts w:ascii="SimSun" w:hAnsi="SimSun" w:eastAsia="SimSun"/>
           <w:b w:val="0"/>
         </w:rPr>
         <w:t xml:space="preserve">作业最终成绩以原生环境 </w:t>
@@ -79,14 +79,14 @@
         <w:rPr>
           <w:rFonts w:ascii="Consolas" w:hAnsi="Consolas" w:eastAsia="Consolas"/>
           <w:b w:val="0"/>
-          <w:color w:val="282828"/>
+          <w:color w:val="000000"/>
           <w:sz w:val="19"/>
         </w:rPr>
         <w:t>step()</w:t>
       </w:r>
       <w:r>
         <w:rPr>
-          <w:rFonts w:ascii="Microsoft YaHei" w:hAnsi="Microsoft YaHei" w:eastAsia="Microsoft YaHei"/>
+          <w:rFonts w:ascii="SimSun" w:hAnsi="SimSun" w:eastAsia="SimSun"/>
           <w:b w:val="0"/>
         </w:rPr>
         <w:t xml:space="preserve"> 返回的原始累计奖励为准，因此训练过程可以使用不同算法、不同日志方式和 checkpoint 策略，但最终评估必须加载训练好的 policy，在 </w:t>
@@ -95,14 +95,14 @@
         <w:rPr>
           <w:rFonts w:ascii="Consolas" w:hAnsi="Consolas" w:eastAsia="Consolas"/>
           <w:b w:val="0"/>
-          <w:color w:val="282828"/>
+          <w:color w:val="000000"/>
           <w:sz w:val="19"/>
         </w:rPr>
         <w:t>Humanoid-v5</w:t>
       </w:r>
       <w:r>
         <w:rPr>
-          <w:rFonts w:ascii="Microsoft YaHei" w:hAnsi="Microsoft YaHei" w:eastAsia="Microsoft YaHei"/>
+          <w:rFonts w:ascii="SimSun" w:hAnsi="SimSun" w:eastAsia="SimSun"/>
           <w:b w:val="0"/>
         </w:rPr>
         <w:t xml:space="preserve"> 原生环境中统计 raw reward。本项目未修改环境物理参数、奖励函数或 </w:t>
@@ -111,14 +111,14 @@
         <w:rPr>
           <w:rFonts w:ascii="Consolas" w:hAnsi="Consolas" w:eastAsia="Consolas"/>
           <w:b w:val="0"/>
-          <w:color w:val="282828"/>
+          <w:color w:val="000000"/>
           <w:sz w:val="19"/>
         </w:rPr>
         <w:t>step()</w:t>
       </w:r>
       <w:r>
         <w:rPr>
-          <w:rFonts w:ascii="Microsoft YaHei" w:hAnsi="Microsoft YaHei" w:eastAsia="Microsoft YaHei"/>
+          <w:rFonts w:ascii="SimSun" w:hAnsi="SimSun" w:eastAsia="SimSun"/>
           <w:b w:val="0"/>
         </w:rPr>
         <w:t xml:space="preserve"> 返回值。</w:t>
@@ -128,7 +128,7 @@
     <w:p>
       <w:r>
         <w:rPr>
-          <w:rFonts w:ascii="Microsoft YaHei" w:hAnsi="Microsoft YaHei" w:eastAsia="Microsoft YaHei"/>
+          <w:rFonts w:ascii="SimSun" w:hAnsi="SimSun" w:eastAsia="SimSun"/>
           <w:b w:val="0"/>
         </w:rPr>
         <w:t>训练和提交过程中重点满足以下要求：</w:t>
@@ -141,7 +141,7 @@
       </w:pPr>
       <w:r>
         <w:rPr>
-          <w:rFonts w:ascii="Microsoft YaHei" w:hAnsi="Microsoft YaHei" w:eastAsia="Microsoft YaHei"/>
+          <w:rFonts w:ascii="SimSun" w:hAnsi="SimSun" w:eastAsia="SimSun"/>
           <w:b w:val="0"/>
         </w:rPr>
         <w:t>保存完整训练配置和依赖版本，保证实验可复现。</w:t>
@@ -153,7 +153,7 @@
       </w:pPr>
       <w:r>
         <w:rPr>
-          <w:rFonts w:ascii="Microsoft YaHei" w:hAnsi="Microsoft YaHei" w:eastAsia="Microsoft YaHei"/>
+          <w:rFonts w:ascii="SimSun" w:hAnsi="SimSun" w:eastAsia="SimSun"/>
           <w:b w:val="0"/>
         </w:rPr>
         <w:t>保存训练过程中的 checkpoint，便于中断续训、回溯和模型选择。</w:t>
@@ -165,7 +165,7 @@
       </w:pPr>
       <w:r>
         <w:rPr>
-          <w:rFonts w:ascii="Microsoft YaHei" w:hAnsi="Microsoft YaHei" w:eastAsia="Microsoft YaHei"/>
+          <w:rFonts w:ascii="SimSun" w:hAnsi="SimSun" w:eastAsia="SimSun"/>
           <w:b w:val="0"/>
         </w:rPr>
         <w:t>使用原生环境 raw reward 进行最终评估。</w:t>
@@ -177,7 +177,7 @@
       </w:pPr>
       <w:r>
         <w:rPr>
-          <w:rFonts w:ascii="Microsoft YaHei" w:hAnsi="Microsoft YaHei" w:eastAsia="Microsoft YaHei"/>
+          <w:rFonts w:ascii="SimSun" w:hAnsi="SimSun" w:eastAsia="SimSun"/>
           <w:b w:val="0"/>
         </w:rPr>
         <w:t>训练步数严格控制在 5,000,000 环境交互步以内。</w:t>
@@ -189,7 +189,7 @@
       </w:pPr>
       <w:r>
         <w:rPr>
-          <w:rFonts w:ascii="Microsoft YaHei" w:hAnsi="Microsoft YaHei" w:eastAsia="Microsoft YaHei"/>
+          <w:rFonts w:ascii="SimSun" w:hAnsi="SimSun" w:eastAsia="SimSun"/>
           <w:b w:val="0"/>
         </w:rPr>
         <w:t>提交训练好的 policy 文件，便于助教加载验证。</w:t>
@@ -201,7 +201,7 @@
       </w:pPr>
       <w:r>
         <w:rPr>
-          <w:rFonts w:ascii="Microsoft YaHei" w:hAnsi="Microsoft YaHei" w:eastAsia="Microsoft YaHei"/>
+          <w:rFonts w:ascii="SimSun" w:hAnsi="SimSun" w:eastAsia="SimSun"/>
           <w:b w:val="0"/>
         </w:rPr>
         <w:t>按补充通知提交训练过程分段视频、最终结果截图和说明。</w:t>
@@ -220,7 +220,7 @@
     <w:p>
       <w:r>
         <w:rPr>
-          <w:rFonts w:ascii="Microsoft YaHei" w:hAnsi="Microsoft YaHei" w:eastAsia="Microsoft YaHei"/>
+          <w:rFonts w:ascii="SimSun" w:hAnsi="SimSun" w:eastAsia="SimSun"/>
           <w:b w:val="0"/>
         </w:rPr>
         <w:t>最终实验环境如下：</w:t>
@@ -303,7 +303,7 @@
     <w:p>
       <w:r>
         <w:rPr>
-          <w:rFonts w:ascii="Microsoft YaHei" w:hAnsi="Microsoft YaHei" w:eastAsia="Microsoft YaHei"/>
+          <w:rFonts w:ascii="SimSun" w:hAnsi="SimSun" w:eastAsia="SimSun"/>
           <w:b w:val="0"/>
         </w:rPr>
         <w:t xml:space="preserve">依赖版本记录在 </w:t>
@@ -312,14 +312,14 @@
         <w:rPr>
           <w:rFonts w:ascii="Consolas" w:hAnsi="Consolas" w:eastAsia="Consolas"/>
           <w:b w:val="0"/>
-          <w:color w:val="282828"/>
+          <w:color w:val="000000"/>
           <w:sz w:val="19"/>
         </w:rPr>
         <w:t>requirements.txt</w:t>
       </w:r>
       <w:r>
         <w:rPr>
-          <w:rFonts w:ascii="Microsoft YaHei" w:hAnsi="Microsoft YaHei" w:eastAsia="Microsoft YaHei"/>
+          <w:rFonts w:ascii="SimSun" w:hAnsi="SimSun" w:eastAsia="SimSun"/>
           <w:b w:val="0"/>
         </w:rPr>
         <w:t xml:space="preserve"> 中。最终模型在本地 Windows + Conda CPU 环境中训练完成：</w:t>
@@ -390,7 +390,7 @@
     <w:p>
       <w:r>
         <w:rPr>
-          <w:rFonts w:ascii="Microsoft YaHei" w:hAnsi="Microsoft YaHei" w:eastAsia="Microsoft YaHei"/>
+          <w:rFonts w:ascii="SimSun" w:hAnsi="SimSun" w:eastAsia="SimSun"/>
           <w:b w:val="0"/>
         </w:rPr>
         <w:t>早期也尝试过 Colab 和 Kaggle。云端平台适合快速验证，但存在断连、运行时重置、GPU 限额、输出不易回看等问题。最终选择本地 CPU 完成完整 5,000,000 步训练，主要原因是本地训练不中断、便于录屏、便于保存所有 checkpoint。</w:t>
@@ -409,7 +409,7 @@
     <w:p>
       <w:r>
         <w:rPr>
-          <w:rFonts w:ascii="Microsoft YaHei" w:hAnsi="Microsoft YaHei" w:eastAsia="Microsoft YaHei"/>
+          <w:rFonts w:ascii="SimSun" w:hAnsi="SimSun" w:eastAsia="SimSun"/>
           <w:b w:val="0"/>
         </w:rPr>
         <w:t>本项目先后尝试了 PPO、RL Zoo 风格 PPO、SAC 和 TD3。最终采用 Soft Actor-Critic (SAC)。</w:t>
@@ -419,7 +419,7 @@
     <w:p>
       <w:r>
         <w:rPr>
-          <w:rFonts w:ascii="Microsoft YaHei" w:hAnsi="Microsoft YaHei" w:eastAsia="Microsoft YaHei"/>
+          <w:rFonts w:ascii="SimSun" w:hAnsi="SimSun" w:eastAsia="SimSun"/>
           <w:b w:val="0"/>
         </w:rPr>
         <w:t>SAC 是一种最大熵 off-policy actor-critic 算法，适合连续动作控制任务。它同时优化累计奖励和策略熵，既追求高奖励，也保留一定探索能力。与 PPO 相比，SAC 能复用经验回放池中的历史样本，在本任务中表现出更高的样本效率和更好的最终分数。</w:t>
@@ -429,7 +429,7 @@
     <w:p>
       <w:r>
         <w:rPr>
-          <w:rFonts w:ascii="Microsoft YaHei" w:hAnsi="Microsoft YaHei" w:eastAsia="Microsoft YaHei"/>
+          <w:rFonts w:ascii="SimSun" w:hAnsi="SimSun" w:eastAsia="SimSun"/>
           <w:b w:val="0"/>
         </w:rPr>
         <w:t>最终配置文件为：</w:t>
@@ -452,7 +452,7 @@
     <w:p>
       <w:r>
         <w:rPr>
-          <w:rFonts w:ascii="Microsoft YaHei" w:hAnsi="Microsoft YaHei" w:eastAsia="Microsoft YaHei"/>
+          <w:rFonts w:ascii="SimSun" w:hAnsi="SimSun" w:eastAsia="SimSun"/>
           <w:b w:val="0"/>
         </w:rPr>
         <w:t>核心参数如下：</w:t>
@@ -643,7 +643,7 @@
     <w:p>
       <w:r>
         <w:rPr>
-          <w:rFonts w:ascii="Microsoft YaHei" w:hAnsi="Microsoft YaHei" w:eastAsia="Microsoft YaHei"/>
+          <w:rFonts w:ascii="SimSun" w:hAnsi="SimSun" w:eastAsia="SimSun"/>
           <w:b w:val="0"/>
         </w:rPr>
         <w:t>最终 SAC 模型没有使用 VecNormalize，因此提交和测试时只需要 policy checkpoint，不需要额外加载归一化统计文件。</w:t>
@@ -662,7 +662,7 @@
     <w:p>
       <w:r>
         <w:rPr>
-          <w:rFonts w:ascii="Microsoft YaHei" w:hAnsi="Microsoft YaHei" w:eastAsia="Microsoft YaHei"/>
+          <w:rFonts w:ascii="SimSun" w:hAnsi="SimSun" w:eastAsia="SimSun"/>
           <w:b w:val="0"/>
         </w:rPr>
         <w:t>为保证实验过程可复现，本项目固定了训练配置、依赖版本、训练步数和随机种子，并在每个 run 中保存配置与元数据。</w:t>
@@ -672,7 +672,7 @@
     <w:p>
       <w:r>
         <w:rPr>
-          <w:rFonts w:ascii="Microsoft YaHei" w:hAnsi="Microsoft YaHei" w:eastAsia="Microsoft YaHei"/>
+          <w:rFonts w:ascii="SimSun" w:hAnsi="SimSun" w:eastAsia="SimSun"/>
           <w:b w:val="0"/>
         </w:rPr>
         <w:t>主要设置如下：</w:t>
@@ -685,7 +685,7 @@
       </w:pPr>
       <w:r>
         <w:rPr>
-          <w:rFonts w:ascii="Microsoft YaHei" w:hAnsi="Microsoft YaHei" w:eastAsia="Microsoft YaHei"/>
+          <w:rFonts w:ascii="SimSun" w:hAnsi="SimSun" w:eastAsia="SimSun"/>
           <w:b w:val="0"/>
         </w:rPr>
         <w:t xml:space="preserve">固定环境为 </w:t>
@@ -694,14 +694,14 @@
         <w:rPr>
           <w:rFonts w:ascii="Consolas" w:hAnsi="Consolas" w:eastAsia="Consolas"/>
           <w:b w:val="0"/>
-          <w:color w:val="282828"/>
+          <w:color w:val="000000"/>
           <w:sz w:val="19"/>
         </w:rPr>
         <w:t>Humanoid-v5</w:t>
       </w:r>
       <w:r>
         <w:rPr>
-          <w:rFonts w:ascii="Microsoft YaHei" w:hAnsi="Microsoft YaHei" w:eastAsia="Microsoft YaHei"/>
+          <w:rFonts w:ascii="SimSun" w:hAnsi="SimSun" w:eastAsia="SimSun"/>
           <w:b w:val="0"/>
         </w:rPr>
         <w:t>。</w:t>
@@ -713,7 +713,7 @@
       </w:pPr>
       <w:r>
         <w:rPr>
-          <w:rFonts w:ascii="Microsoft YaHei" w:hAnsi="Microsoft YaHei" w:eastAsia="Microsoft YaHei"/>
+          <w:rFonts w:ascii="SimSun" w:hAnsi="SimSun" w:eastAsia="SimSun"/>
           <w:b w:val="0"/>
         </w:rPr>
         <w:t xml:space="preserve">固定训练随机种子为 </w:t>
@@ -722,14 +722,14 @@
         <w:rPr>
           <w:rFonts w:ascii="Consolas" w:hAnsi="Consolas" w:eastAsia="Consolas"/>
           <w:b w:val="0"/>
-          <w:color w:val="282828"/>
+          <w:color w:val="000000"/>
           <w:sz w:val="19"/>
         </w:rPr>
         <w:t>3407</w:t>
       </w:r>
       <w:r>
         <w:rPr>
-          <w:rFonts w:ascii="Microsoft YaHei" w:hAnsi="Microsoft YaHei" w:eastAsia="Microsoft YaHei"/>
+          <w:rFonts w:ascii="SimSun" w:hAnsi="SimSun" w:eastAsia="SimSun"/>
           <w:b w:val="0"/>
         </w:rPr>
         <w:t>。</w:t>
@@ -741,7 +741,7 @@
       </w:pPr>
       <w:r>
         <w:rPr>
-          <w:rFonts w:ascii="Microsoft YaHei" w:hAnsi="Microsoft YaHei" w:eastAsia="Microsoft YaHei"/>
+          <w:rFonts w:ascii="SimSun" w:hAnsi="SimSun" w:eastAsia="SimSun"/>
           <w:b w:val="0"/>
         </w:rPr>
         <w:t xml:space="preserve">固定最终训练上限为 </w:t>
@@ -750,14 +750,14 @@
         <w:rPr>
           <w:rFonts w:ascii="Consolas" w:hAnsi="Consolas" w:eastAsia="Consolas"/>
           <w:b w:val="0"/>
-          <w:color w:val="282828"/>
+          <w:color w:val="000000"/>
           <w:sz w:val="19"/>
         </w:rPr>
         <w:t>5,000,000</w:t>
       </w:r>
       <w:r>
         <w:rPr>
-          <w:rFonts w:ascii="Microsoft YaHei" w:hAnsi="Microsoft YaHei" w:eastAsia="Microsoft YaHei"/>
+          <w:rFonts w:ascii="SimSun" w:hAnsi="SimSun" w:eastAsia="SimSun"/>
           <w:b w:val="0"/>
         </w:rPr>
         <w:t xml:space="preserve"> 环境交互步。</w:t>
@@ -769,7 +769,7 @@
       </w:pPr>
       <w:r>
         <w:rPr>
-          <w:rFonts w:ascii="Microsoft YaHei" w:hAnsi="Microsoft YaHei" w:eastAsia="Microsoft YaHei"/>
+          <w:rFonts w:ascii="SimSun" w:hAnsi="SimSun" w:eastAsia="SimSun"/>
           <w:b w:val="0"/>
         </w:rPr>
         <w:t>每隔固定步数保存 checkpoint，支持中断后继续训练。</w:t>
@@ -781,7 +781,7 @@
       </w:pPr>
       <w:r>
         <w:rPr>
-          <w:rFonts w:ascii="Microsoft YaHei" w:hAnsi="Microsoft YaHei" w:eastAsia="Microsoft YaHei"/>
+          <w:rFonts w:ascii="SimSun" w:hAnsi="SimSun" w:eastAsia="SimSun"/>
           <w:b w:val="0"/>
         </w:rPr>
         <w:t xml:space="preserve">评估阶段显式传入测试 seed，并通过 </w:t>
@@ -790,14 +790,14 @@
         <w:rPr>
           <w:rFonts w:ascii="Consolas" w:hAnsi="Consolas" w:eastAsia="Consolas"/>
           <w:b w:val="0"/>
-          <w:color w:val="282828"/>
+          <w:color w:val="000000"/>
           <w:sz w:val="19"/>
         </w:rPr>
         <w:t>env.reset(seed=...)</w:t>
       </w:r>
       <w:r>
         <w:rPr>
-          <w:rFonts w:ascii="Microsoft YaHei" w:hAnsi="Microsoft YaHei" w:eastAsia="Microsoft YaHei"/>
+          <w:rFonts w:ascii="SimSun" w:hAnsi="SimSun" w:eastAsia="SimSun"/>
           <w:b w:val="0"/>
         </w:rPr>
         <w:t xml:space="preserve"> 控制评估初始状态。</w:t>
@@ -809,7 +809,7 @@
       </w:pPr>
       <w:r>
         <w:rPr>
-          <w:rFonts w:ascii="Microsoft YaHei" w:hAnsi="Microsoft YaHei" w:eastAsia="Microsoft YaHei"/>
+          <w:rFonts w:ascii="SimSun" w:hAnsi="SimSun" w:eastAsia="SimSun"/>
           <w:b w:val="0"/>
         </w:rPr>
         <w:t xml:space="preserve">使用 </w:t>
@@ -818,14 +818,14 @@
         <w:rPr>
           <w:rFonts w:ascii="Consolas" w:hAnsi="Consolas" w:eastAsia="Consolas"/>
           <w:b w:val="0"/>
-          <w:color w:val="282828"/>
+          <w:color w:val="000000"/>
           <w:sz w:val="19"/>
         </w:rPr>
         <w:t>evaluate_checkpoints.py</w:t>
       </w:r>
       <w:r>
         <w:rPr>
-          <w:rFonts w:ascii="Microsoft YaHei" w:hAnsi="Microsoft YaHei" w:eastAsia="Microsoft YaHei"/>
+          <w:rFonts w:ascii="SimSun" w:hAnsi="SimSun" w:eastAsia="SimSun"/>
           <w:b w:val="0"/>
         </w:rPr>
         <w:t>、</w:t>
@@ -834,14 +834,14 @@
         <w:rPr>
           <w:rFonts w:ascii="Consolas" w:hAnsi="Consolas" w:eastAsia="Consolas"/>
           <w:b w:val="0"/>
-          <w:color w:val="282828"/>
+          <w:color w:val="000000"/>
           <w:sz w:val="19"/>
         </w:rPr>
         <w:t>evaluate.py</w:t>
       </w:r>
       <w:r>
         <w:rPr>
-          <w:rFonts w:ascii="Microsoft YaHei" w:hAnsi="Microsoft YaHei" w:eastAsia="Microsoft YaHei"/>
+          <w:rFonts w:ascii="SimSun" w:hAnsi="SimSun" w:eastAsia="SimSun"/>
           <w:b w:val="0"/>
         </w:rPr>
         <w:t xml:space="preserve"> 和 </w:t>
@@ -850,14 +850,14 @@
         <w:rPr>
           <w:rFonts w:ascii="Consolas" w:hAnsi="Consolas" w:eastAsia="Consolas"/>
           <w:b w:val="0"/>
-          <w:color w:val="282828"/>
+          <w:color w:val="000000"/>
           <w:sz w:val="19"/>
         </w:rPr>
         <w:t>test.py</w:t>
       </w:r>
       <w:r>
         <w:rPr>
-          <w:rFonts w:ascii="Microsoft YaHei" w:hAnsi="Microsoft YaHei" w:eastAsia="Microsoft YaHei"/>
+          <w:rFonts w:ascii="SimSun" w:hAnsi="SimSun" w:eastAsia="SimSun"/>
           <w:b w:val="0"/>
         </w:rPr>
         <w:t xml:space="preserve"> 保存评估 CSV/JSON，便于复查。</w:t>
@@ -867,7 +867,7 @@
     <w:p>
       <w:r>
         <w:rPr>
-          <w:rFonts w:ascii="Microsoft YaHei" w:hAnsi="Microsoft YaHei" w:eastAsia="Microsoft YaHei"/>
+          <w:rFonts w:ascii="SimSun" w:hAnsi="SimSun" w:eastAsia="SimSun"/>
           <w:b w:val="0"/>
         </w:rPr>
         <w:t>需要说明的是，深度强化学习训练过程存在一定非确定性，例如神经网络初始化、经验回放采样和硬件平台差异都可能造成训练轨迹变化。因此最终以提交的 policy checkpoint 在原生环境中的 raw reward 评估结果为准。</w:t>
@@ -886,7 +886,7 @@
     <w:p>
       <w:r>
         <w:rPr>
-          <w:rFonts w:ascii="Microsoft YaHei" w:hAnsi="Microsoft YaHei" w:eastAsia="Microsoft YaHei"/>
+          <w:rFonts w:ascii="SimSun" w:hAnsi="SimSun" w:eastAsia="SimSun"/>
           <w:b w:val="0"/>
         </w:rPr>
         <w:t>训练脚本使用两种输出模式：</w:t>
@@ -899,7 +899,7 @@
       </w:pPr>
       <w:r>
         <w:rPr>
-          <w:rFonts w:ascii="Microsoft YaHei" w:hAnsi="Microsoft YaHei" w:eastAsia="Microsoft YaHei"/>
+          <w:rFonts w:ascii="SimSun" w:hAnsi="SimSun" w:eastAsia="SimSun"/>
           <w:b w:val="0"/>
         </w:rPr>
         <w:t>多输出模式：用于录屏展示。开启进度条和指标表，较高频输出 reward、episode length、fps 和训练损失。</w:t>
@@ -911,7 +911,7 @@
       </w:pPr>
       <w:r>
         <w:rPr>
-          <w:rFonts w:ascii="Microsoft YaHei" w:hAnsi="Microsoft YaHei" w:eastAsia="Microsoft YaHei"/>
+          <w:rFonts w:ascii="SimSun" w:hAnsi="SimSun" w:eastAsia="SimSun"/>
           <w:b w:val="0"/>
         </w:rPr>
         <w:t>安静输出模式：用于长时间训练。关闭进度条并低频输出，避免终端输出过多。</w:t>
@@ -921,7 +921,7 @@
     <w:p>
       <w:r>
         <w:rPr>
-          <w:rFonts w:ascii="Microsoft YaHei" w:hAnsi="Microsoft YaHei" w:eastAsia="Microsoft YaHei"/>
+          <w:rFonts w:ascii="SimSun" w:hAnsi="SimSun" w:eastAsia="SimSun"/>
           <w:b w:val="0"/>
         </w:rPr>
         <w:t xml:space="preserve">下面四段命令使用同一个 run 名称 </w:t>
@@ -930,14 +930,14 @@
         <w:rPr>
           <w:rFonts w:ascii="Consolas" w:hAnsi="Consolas" w:eastAsia="Consolas"/>
           <w:b w:val="0"/>
-          <w:color w:val="282828"/>
+          <w:color w:val="000000"/>
           <w:sz w:val="19"/>
         </w:rPr>
         <w:t>local_sac_cpu_5m_seed3407</w:t>
       </w:r>
       <w:r>
         <w:rPr>
-          <w:rFonts w:ascii="Microsoft YaHei" w:hAnsi="Microsoft YaHei" w:eastAsia="Microsoft YaHei"/>
+          <w:rFonts w:ascii="SimSun" w:hAnsi="SimSun" w:eastAsia="SimSun"/>
           <w:b w:val="0"/>
         </w:rPr>
         <w:t>，按顺序运行即可复现完整训练流程。</w:t>
@@ -956,7 +956,7 @@
     <w:p>
       <w:r>
         <w:rPr>
-          <w:rFonts w:ascii="Microsoft YaHei" w:hAnsi="Microsoft YaHei" w:eastAsia="Microsoft YaHei"/>
+          <w:rFonts w:ascii="SimSun" w:hAnsi="SimSun" w:eastAsia="SimSun"/>
           <w:b w:val="0"/>
         </w:rPr>
         <w:t>用于展示训练开始阶段。</w:t>
@@ -988,7 +988,7 @@
     <w:p>
       <w:r>
         <w:rPr>
-          <w:rFonts w:ascii="Microsoft YaHei" w:hAnsi="Microsoft YaHei" w:eastAsia="Microsoft YaHei"/>
+          <w:rFonts w:ascii="SimSun" w:hAnsi="SimSun" w:eastAsia="SimSun"/>
           <w:b w:val="0"/>
         </w:rPr>
         <w:t>用于完成较长的中前期训练。</w:t>
@@ -1020,7 +1020,7 @@
     <w:p>
       <w:r>
         <w:rPr>
-          <w:rFonts w:ascii="Microsoft YaHei" w:hAnsi="Microsoft YaHei" w:eastAsia="Microsoft YaHei"/>
+          <w:rFonts w:ascii="SimSun" w:hAnsi="SimSun" w:eastAsia="SimSun"/>
           <w:b w:val="0"/>
         </w:rPr>
         <w:t>用于展示训练中期阶段。</w:t>
@@ -1052,7 +1052,7 @@
     <w:p>
       <w:r>
         <w:rPr>
-          <w:rFonts w:ascii="Microsoft YaHei" w:hAnsi="Microsoft YaHei" w:eastAsia="Microsoft YaHei"/>
+          <w:rFonts w:ascii="SimSun" w:hAnsi="SimSun" w:eastAsia="SimSun"/>
           <w:b w:val="0"/>
         </w:rPr>
         <w:t>用于完成最终训练并保存最终 policy。</w:t>
@@ -1084,7 +1084,7 @@
     <w:p>
       <w:r>
         <w:rPr>
-          <w:rFonts w:ascii="Microsoft YaHei" w:hAnsi="Microsoft YaHei" w:eastAsia="Microsoft YaHei"/>
+          <w:rFonts w:ascii="SimSun" w:hAnsi="SimSun" w:eastAsia="SimSun"/>
           <w:b w:val="0"/>
         </w:rPr>
         <w:t>训练完成后没有直接只使用最后一个模型，而是先扫描多个 checkpoint 进行初筛，再对最佳 checkpoint 进行正式测试。</w:t>
@@ -1103,7 +1103,7 @@
     <w:p>
       <w:r>
         <w:rPr>
-          <w:rFonts w:ascii="Microsoft YaHei" w:hAnsi="Microsoft YaHei" w:eastAsia="Microsoft YaHei"/>
+          <w:rFonts w:ascii="SimSun" w:hAnsi="SimSun" w:eastAsia="SimSun"/>
           <w:b w:val="0"/>
         </w:rPr>
         <w:t xml:space="preserve">使用 </w:t>
@@ -1112,14 +1112,14 @@
         <w:rPr>
           <w:rFonts w:ascii="Consolas" w:hAnsi="Consolas" w:eastAsia="Consolas"/>
           <w:b w:val="0"/>
-          <w:color w:val="282828"/>
+          <w:color w:val="000000"/>
           <w:sz w:val="19"/>
         </w:rPr>
         <w:t>evaluate_checkpoints.py</w:t>
       </w:r>
       <w:r>
         <w:rPr>
-          <w:rFonts w:ascii="Microsoft YaHei" w:hAnsi="Microsoft YaHei" w:eastAsia="Microsoft YaHei"/>
+          <w:rFonts w:ascii="SimSun" w:hAnsi="SimSun" w:eastAsia="SimSun"/>
           <w:b w:val="0"/>
         </w:rPr>
         <w:t xml:space="preserve"> 扫描保存的 checkpoint。初筛阶段使用 seeds </w:t>
@@ -1128,14 +1128,14 @@
         <w:rPr>
           <w:rFonts w:ascii="Consolas" w:hAnsi="Consolas" w:eastAsia="Consolas"/>
           <w:b w:val="0"/>
-          <w:color w:val="282828"/>
+          <w:color w:val="000000"/>
           <w:sz w:val="19"/>
         </w:rPr>
         <w:t>0 1 2 3 4</w:t>
       </w:r>
       <w:r>
         <w:rPr>
-          <w:rFonts w:ascii="Microsoft YaHei" w:hAnsi="Microsoft YaHei" w:eastAsia="Microsoft YaHei"/>
+          <w:rFonts w:ascii="SimSun" w:hAnsi="SimSun" w:eastAsia="SimSun"/>
           <w:b w:val="0"/>
         </w:rPr>
         <w:t>，每个 seed 测试 1 个 episode，并按 mean reward 排序。</w:t>
@@ -1158,7 +1158,7 @@
     <w:p>
       <w:r>
         <w:rPr>
-          <w:rFonts w:ascii="Microsoft YaHei" w:hAnsi="Microsoft YaHei" w:eastAsia="Microsoft YaHei"/>
+          <w:rFonts w:ascii="SimSun" w:hAnsi="SimSun" w:eastAsia="SimSun"/>
           <w:b w:val="0"/>
         </w:rPr>
         <w:t>完整 checkpoint sweep 数据保存于：</w:t>
@@ -1181,7 +1181,7 @@
     <w:p>
       <w:r>
         <w:rPr>
-          <w:rFonts w:ascii="Microsoft YaHei" w:hAnsi="Microsoft YaHei" w:eastAsia="Microsoft YaHei"/>
+          <w:rFonts w:ascii="SimSun" w:hAnsi="SimSun" w:eastAsia="SimSun"/>
           <w:b w:val="0"/>
         </w:rPr>
         <w:t xml:space="preserve">图 1 展示了不同 checkpoint 的平均原始累计奖励变化。可以看到，模型在训练后期整体保持较高水平，其中 </w:t>
@@ -1190,14 +1190,14 @@
         <w:rPr>
           <w:rFonts w:ascii="Consolas" w:hAnsi="Consolas" w:eastAsia="Consolas"/>
           <w:b w:val="0"/>
-          <w:color w:val="282828"/>
+          <w:color w:val="000000"/>
           <w:sz w:val="19"/>
         </w:rPr>
         <w:t>5,000,000</w:t>
       </w:r>
       <w:r>
         <w:rPr>
-          <w:rFonts w:ascii="Microsoft YaHei" w:hAnsi="Microsoft YaHei" w:eastAsia="Microsoft YaHei"/>
+          <w:rFonts w:ascii="SimSun" w:hAnsi="SimSun" w:eastAsia="SimSun"/>
           <w:b w:val="0"/>
         </w:rPr>
         <w:t xml:space="preserve"> 步 checkpoint 的平均奖励最高。</w:t>
@@ -1250,8 +1250,8 @@
       </w:pPr>
       <w:r>
         <w:rPr>
-          <w:rFonts w:ascii="Microsoft YaHei" w:hAnsi="Microsoft YaHei" w:eastAsia="Microsoft YaHei"/>
-          <w:color w:val="505050"/>
+          <w:rFonts w:ascii="SimSun" w:hAnsi="SimSun" w:eastAsia="SimSun"/>
+          <w:color w:val="000000"/>
           <w:sz w:val="18"/>
         </w:rPr>
         <w:t>图 1：Checkpoint sweep 中各训练步数的平均原始累计奖励</w:t>
@@ -1261,7 +1261,7 @@
     <w:p>
       <w:r>
         <w:rPr>
-          <w:rFonts w:ascii="Microsoft YaHei" w:hAnsi="Microsoft YaHei" w:eastAsia="Microsoft YaHei"/>
+          <w:rFonts w:ascii="SimSun" w:hAnsi="SimSun" w:eastAsia="SimSun"/>
           <w:b w:val="0"/>
         </w:rPr>
         <w:t>初筛结果前十名如下：</w:t>
@@ -1404,7 +1404,7 @@
     <w:p>
       <w:r>
         <w:rPr>
-          <w:rFonts w:ascii="Microsoft YaHei" w:hAnsi="Microsoft YaHei" w:eastAsia="Microsoft YaHei"/>
+          <w:rFonts w:ascii="SimSun" w:hAnsi="SimSun" w:eastAsia="SimSun"/>
           <w:b w:val="0"/>
         </w:rPr>
         <w:t xml:space="preserve">初筛结果显示 </w:t>
@@ -1413,14 +1413,14 @@
         <w:rPr>
           <w:rFonts w:ascii="Consolas" w:hAnsi="Consolas" w:eastAsia="Consolas"/>
           <w:b w:val="0"/>
-          <w:color w:val="282828"/>
+          <w:color w:val="000000"/>
           <w:sz w:val="19"/>
         </w:rPr>
         <w:t>5000000</w:t>
       </w:r>
       <w:r>
         <w:rPr>
-          <w:rFonts w:ascii="Microsoft YaHei" w:hAnsi="Microsoft YaHei" w:eastAsia="Microsoft YaHei"/>
+          <w:rFonts w:ascii="SimSun" w:hAnsi="SimSun" w:eastAsia="SimSun"/>
           <w:b w:val="0"/>
         </w:rPr>
         <w:t xml:space="preserve"> 步 checkpoint 表现最好，因此选择它作为最终提交 policy。</w:t>
@@ -1439,7 +1439,7 @@
     <w:p>
       <w:r>
         <w:rPr>
-          <w:rFonts w:ascii="Microsoft YaHei" w:hAnsi="Microsoft YaHei" w:eastAsia="Microsoft YaHei"/>
+          <w:rFonts w:ascii="SimSun" w:hAnsi="SimSun" w:eastAsia="SimSun"/>
           <w:b w:val="0"/>
         </w:rPr>
         <w:t xml:space="preserve">对初筛选出的 </w:t>
@@ -1448,14 +1448,14 @@
         <w:rPr>
           <w:rFonts w:ascii="Consolas" w:hAnsi="Consolas" w:eastAsia="Consolas"/>
           <w:b w:val="0"/>
-          <w:color w:val="282828"/>
+          <w:color w:val="000000"/>
           <w:sz w:val="19"/>
         </w:rPr>
         <w:t>5000000</w:t>
       </w:r>
       <w:r>
         <w:rPr>
-          <w:rFonts w:ascii="Microsoft YaHei" w:hAnsi="Microsoft YaHei" w:eastAsia="Microsoft YaHei"/>
+          <w:rFonts w:ascii="SimSun" w:hAnsi="SimSun" w:eastAsia="SimSun"/>
           <w:b w:val="0"/>
         </w:rPr>
         <w:t xml:space="preserve"> 步 checkpoint 进行正式 10-seed 原始累计奖励评估：</w:t>
@@ -1478,7 +1478,7 @@
     <w:p>
       <w:r>
         <w:rPr>
-          <w:rFonts w:ascii="Microsoft YaHei" w:hAnsi="Microsoft YaHei" w:eastAsia="Microsoft YaHei"/>
+          <w:rFonts w:ascii="SimSun" w:hAnsi="SimSun" w:eastAsia="SimSun"/>
           <w:b w:val="0"/>
         </w:rPr>
         <w:t>结果如下：</w:t>
@@ -1561,7 +1561,7 @@
     <w:p>
       <w:r>
         <w:rPr>
-          <w:rFonts w:ascii="Microsoft YaHei" w:hAnsi="Microsoft YaHei" w:eastAsia="Microsoft YaHei"/>
+          <w:rFonts w:ascii="SimSun" w:hAnsi="SimSun" w:eastAsia="SimSun"/>
           <w:b w:val="0"/>
         </w:rPr>
         <w:t>各 seed 奖励如下：</w:t>
@@ -1605,23 +1605,23 @@
     <w:p>
       <w:r>
         <w:rPr>
-          <w:rFonts w:ascii="Microsoft YaHei" w:hAnsi="Microsoft YaHei" w:eastAsia="Microsoft YaHei"/>
+          <w:rFonts w:ascii="SimSun" w:hAnsi="SimSun" w:eastAsia="SimSun"/>
           <w:b w:val="0"/>
         </w:rPr>
-        <w:t xml:space="preserve">另外使用固定 </w:t>
+        <w:t xml:space="preserve">另外使用与训练一致的固定 </w:t>
       </w:r>
       <w:r>
         <w:rPr>
           <w:rFonts w:ascii="Consolas" w:hAnsi="Consolas" w:eastAsia="Consolas"/>
           <w:b w:val="0"/>
-          <w:color w:val="282828"/>
+          <w:color w:val="000000"/>
           <w:sz w:val="19"/>
         </w:rPr>
-        <w:t>seed=123</w:t>
+        <w:t>seed=3407</w:t>
       </w:r>
       <w:r>
         <w:rPr>
-          <w:rFonts w:ascii="Microsoft YaHei" w:hAnsi="Microsoft YaHei" w:eastAsia="Microsoft YaHei"/>
+          <w:rFonts w:ascii="SimSun" w:hAnsi="SimSun" w:eastAsia="SimSun"/>
           <w:b w:val="0"/>
         </w:rPr>
         <w:t xml:space="preserve"> 进行单次测试，便于视频和截图展示：</w:t>
@@ -1637,14 +1637,14 @@
           <w:rFonts w:ascii="Consolas" w:hAnsi="Consolas" w:eastAsia="Consolas"/>
           <w:sz w:val="17"/>
         </w:rPr>
-        <w:t>python test.py --run-dir runs/local_sac_cpu_5m_seed3407 --checkpoint-step 5000000 --seed 123 --episodes 1 --device cpu</w:t>
+        <w:t>python test.py --run-dir runs/local_sac_cpu_5m_seed3407 --checkpoint-step 5000000 --seed 3407 --episodes 1 --device cpu</w:t>
       </w:r>
     </w:p>
     <w:p/>
     <w:p>
       <w:r>
         <w:rPr>
-          <w:rFonts w:ascii="Microsoft YaHei" w:hAnsi="Microsoft YaHei" w:eastAsia="Microsoft YaHei"/>
+          <w:rFonts w:ascii="SimSun" w:hAnsi="SimSun" w:eastAsia="SimSun"/>
           <w:b w:val="0"/>
         </w:rPr>
         <w:t>结果如下：</w:t>
@@ -1660,7 +1660,7 @@
           <w:rFonts w:ascii="Consolas" w:hAnsi="Consolas" w:eastAsia="Consolas"/>
           <w:sz w:val="17"/>
         </w:rPr>
-        <w:t>raw_reward: 6780.809</w:t>
+        <w:t>raw_reward: 6770.456</w:t>
       </w:r>
     </w:p>
     <w:p>
@@ -1705,14 +1705,14 @@
         <w:rPr>
           <w:rFonts w:ascii="Consolas" w:hAnsi="Consolas" w:eastAsia="Consolas"/>
           <w:b w:val="0"/>
-          <w:color w:val="282828"/>
+          <w:color w:val="000000"/>
           <w:sz w:val="19"/>
         </w:rPr>
         <w:t>length=1000</w:t>
       </w:r>
       <w:r>
         <w:rPr>
-          <w:rFonts w:ascii="Microsoft YaHei" w:hAnsi="Microsoft YaHei" w:eastAsia="Microsoft YaHei"/>
+          <w:rFonts w:ascii="SimSun" w:hAnsi="SimSun" w:eastAsia="SimSun"/>
           <w:b w:val="0"/>
         </w:rPr>
         <w:t xml:space="preserve"> 且 </w:t>
@@ -1721,14 +1721,14 @@
         <w:rPr>
           <w:rFonts w:ascii="Consolas" w:hAnsi="Consolas" w:eastAsia="Consolas"/>
           <w:b w:val="0"/>
-          <w:color w:val="282828"/>
+          <w:color w:val="000000"/>
           <w:sz w:val="19"/>
         </w:rPr>
         <w:t>truncated=True</w:t>
       </w:r>
       <w:r>
         <w:rPr>
-          <w:rFonts w:ascii="Microsoft YaHei" w:hAnsi="Microsoft YaHei" w:eastAsia="Microsoft YaHei"/>
+          <w:rFonts w:ascii="SimSun" w:hAnsi="SimSun" w:eastAsia="SimSun"/>
           <w:b w:val="0"/>
         </w:rPr>
         <w:t xml:space="preserve"> 表示策略能够稳定运行到环境默认最大 episode 长度，而不是提前摔倒终止。</w:t>
@@ -1747,7 +1747,7 @@
     <w:p>
       <w:r>
         <w:rPr>
-          <w:rFonts w:ascii="Microsoft YaHei" w:hAnsi="Microsoft YaHei" w:eastAsia="Microsoft YaHei"/>
+          <w:rFonts w:ascii="SimSun" w:hAnsi="SimSun" w:eastAsia="SimSun"/>
           <w:b w:val="0"/>
         </w:rPr>
         <w:t>根据作业补充通知，训练过程视频采用分段录制方式：训练开始片段、中期片段、尾声截图和最终测试结果。分段训练命令见第 5 节。</w:t>
@@ -1757,7 +1757,7 @@
     <w:p>
       <w:r>
         <w:rPr>
-          <w:rFonts w:ascii="Microsoft YaHei" w:hAnsi="Microsoft YaHei" w:eastAsia="Microsoft YaHei"/>
+          <w:rFonts w:ascii="SimSun" w:hAnsi="SimSun" w:eastAsia="SimSun"/>
           <w:b w:val="0"/>
         </w:rPr>
         <w:t>最终 policy 的行走视频可以用两种方式生成。</w:t>
@@ -1776,7 +1776,7 @@
     <w:p>
       <w:r>
         <w:rPr>
-          <w:rFonts w:ascii="Microsoft YaHei" w:hAnsi="Microsoft YaHei" w:eastAsia="Microsoft YaHei"/>
+          <w:rFonts w:ascii="SimSun" w:hAnsi="SimSun" w:eastAsia="SimSun"/>
           <w:b w:val="0"/>
         </w:rPr>
         <w:t xml:space="preserve">在本地 Windows 环境中可使用 </w:t>
@@ -1785,14 +1785,14 @@
         <w:rPr>
           <w:rFonts w:ascii="Consolas" w:hAnsi="Consolas" w:eastAsia="Consolas"/>
           <w:b w:val="0"/>
-          <w:color w:val="282828"/>
+          <w:color w:val="000000"/>
           <w:sz w:val="19"/>
         </w:rPr>
         <w:t>glfw</w:t>
       </w:r>
       <w:r>
         <w:rPr>
-          <w:rFonts w:ascii="Microsoft YaHei" w:hAnsi="Microsoft YaHei" w:eastAsia="Microsoft YaHei"/>
+          <w:rFonts w:ascii="SimSun" w:hAnsi="SimSun" w:eastAsia="SimSun"/>
           <w:b w:val="0"/>
         </w:rPr>
         <w:t xml:space="preserve"> 后端：</w:t>
@@ -1808,14 +1808,14 @@
           <w:rFonts w:ascii="Consolas" w:hAnsi="Consolas" w:eastAsia="Consolas"/>
           <w:sz w:val="17"/>
         </w:rPr>
-        <w:t>python record_video.py --run-dir runs/local_sac_cpu_5m_seed3407 --checkpoint-step 5000000 --seed 123 --episodes 1 --device cpu --backend glfw --fps 20</w:t>
+        <w:t>python record_video.py --run-dir runs/local_sac_cpu_5m_seed3407 --checkpoint-step 5000000 --seed 3407 --episodes 1 --device cpu --backend glfw --fps 20</w:t>
       </w:r>
     </w:p>
     <w:p/>
     <w:p>
       <w:r>
         <w:rPr>
-          <w:rFonts w:ascii="Microsoft YaHei" w:hAnsi="Microsoft YaHei" w:eastAsia="Microsoft YaHei"/>
+          <w:rFonts w:ascii="SimSun" w:hAnsi="SimSun" w:eastAsia="SimSun"/>
           <w:b w:val="0"/>
         </w:rPr>
         <w:t>视频保存目录：</w:t>
@@ -1847,7 +1847,7 @@
     <w:p>
       <w:r>
         <w:rPr>
-          <w:rFonts w:ascii="Microsoft YaHei" w:hAnsi="Microsoft YaHei" w:eastAsia="Microsoft YaHei"/>
+          <w:rFonts w:ascii="SimSun" w:hAnsi="SimSun" w:eastAsia="SimSun"/>
           <w:b w:val="0"/>
         </w:rPr>
         <w:t>如果直接渲染遇到 MuJoCo/OpenGL 后端问题，可以先导出动作轨迹，再单独渲染：</w:t>
@@ -1863,7 +1863,7 @@
           <w:rFonts w:ascii="Consolas" w:hAnsi="Consolas" w:eastAsia="Consolas"/>
           <w:sz w:val="17"/>
         </w:rPr>
-        <w:t>python export_trajectory.py --run-dir runs/local_sac_cpu_5m_seed3407 --checkpoint-step 5000000 --seed 123 --episodes 1 --device cpu</w:t>
+        <w:t>python export_trajectory.py --run-dir runs/local_sac_cpu_5m_seed3407 --checkpoint-step 5000000 --seed 3407 --episodes 1 --device cpu</w:t>
       </w:r>
     </w:p>
     <w:p/>
@@ -1883,7 +1883,7 @@
     <w:p>
       <w:r>
         <w:rPr>
-          <w:rFonts w:ascii="Microsoft YaHei" w:hAnsi="Microsoft YaHei" w:eastAsia="Microsoft YaHei"/>
+          <w:rFonts w:ascii="SimSun" w:hAnsi="SimSun" w:eastAsia="SimSun"/>
           <w:b w:val="0"/>
         </w:rPr>
         <w:t>这种方式将 policy 执行和 MuJoCo 渲染拆开，稳定性更好。渲染结果保存在：</w:t>
@@ -1915,7 +1915,7 @@
     <w:p>
       <w:r>
         <w:rPr>
-          <w:rFonts w:ascii="Microsoft YaHei" w:hAnsi="Microsoft YaHei" w:eastAsia="Microsoft YaHei"/>
+          <w:rFonts w:ascii="SimSun" w:hAnsi="SimSun" w:eastAsia="SimSun"/>
           <w:b w:val="0"/>
         </w:rPr>
         <w:t xml:space="preserve">从实验结果看，SAC 明显优于本项目尝试过的 PPO 和 TD3 分支。PPO 可以跑通完整流程，但在 Humanoid-v5 上分数较低。RL Zoo 风格 PPO 的 5,000,000 步候选模型正式 10-seed 平均奖励约为 </w:t>
@@ -1924,14 +1924,14 @@
         <w:rPr>
           <w:rFonts w:ascii="Consolas" w:hAnsi="Consolas" w:eastAsia="Consolas"/>
           <w:b w:val="0"/>
-          <w:color w:val="282828"/>
+          <w:color w:val="000000"/>
           <w:sz w:val="19"/>
         </w:rPr>
         <w:t>2179.016</w:t>
       </w:r>
       <w:r>
         <w:rPr>
-          <w:rFonts w:ascii="Microsoft YaHei" w:hAnsi="Microsoft YaHei" w:eastAsia="Microsoft YaHei"/>
+          <w:rFonts w:ascii="SimSun" w:hAnsi="SimSun" w:eastAsia="SimSun"/>
           <w:b w:val="0"/>
         </w:rPr>
         <w:t>，仍明显低于最终 SAC 模型。TD3 早期探针在本地 CPU 上训练速度和效果均不如 SAC，因此未作为最终方向。</w:t>
@@ -1941,7 +1941,7 @@
     <w:p>
       <w:r>
         <w:rPr>
-          <w:rFonts w:ascii="Microsoft YaHei" w:hAnsi="Microsoft YaHei" w:eastAsia="Microsoft YaHei"/>
+          <w:rFonts w:ascii="SimSun" w:hAnsi="SimSun" w:eastAsia="SimSun"/>
           <w:b w:val="0"/>
         </w:rPr>
         <w:t>SAC 的早期训练波动较大，但随着训练继续，策略逐渐学会稳定步态。训练中也观察到 checkpoint 表现并非严格随步数单调提升，因此使用 checkpoint sweep 选择最终模型是必要的。本次最终本地训练中，5,000,000 步 checkpoint 在初筛和正式测试中均表现最好。</w:t>
@@ -1951,7 +1951,7 @@
     <w:p>
       <w:r>
         <w:rPr>
-          <w:rFonts w:ascii="Microsoft YaHei" w:hAnsi="Microsoft YaHei" w:eastAsia="Microsoft YaHei"/>
+          <w:rFonts w:ascii="SimSun" w:hAnsi="SimSun" w:eastAsia="SimSun"/>
           <w:b w:val="0"/>
         </w:rPr>
         <w:t xml:space="preserve">最终模型在 10 个不同测试 seed 下均达到 </w:t>
@@ -1960,14 +1960,14 @@
         <w:rPr>
           <w:rFonts w:ascii="Consolas" w:hAnsi="Consolas" w:eastAsia="Consolas"/>
           <w:b w:val="0"/>
-          <w:color w:val="282828"/>
+          <w:color w:val="000000"/>
           <w:sz w:val="19"/>
         </w:rPr>
         <w:t>mean_length=1000.0</w:t>
       </w:r>
       <w:r>
         <w:rPr>
-          <w:rFonts w:ascii="Microsoft YaHei" w:hAnsi="Microsoft YaHei" w:eastAsia="Microsoft YaHei"/>
+          <w:rFonts w:ascii="SimSun" w:hAnsi="SimSun" w:eastAsia="SimSun"/>
           <w:b w:val="0"/>
         </w:rPr>
         <w:t xml:space="preserve">，说明策略不是只对单个 seed 有效，而是在不同初始条件下都能稳定走完整个 episode。最终 10-seed mean reward 为 </w:t>
@@ -1976,30 +1976,30 @@
         <w:rPr>
           <w:rFonts w:ascii="Consolas" w:hAnsi="Consolas" w:eastAsia="Consolas"/>
           <w:b w:val="0"/>
-          <w:color w:val="282828"/>
+          <w:color w:val="000000"/>
           <w:sz w:val="19"/>
         </w:rPr>
         <w:t>6780.676</w:t>
       </w:r>
       <w:r>
         <w:rPr>
-          <w:rFonts w:ascii="Microsoft YaHei" w:hAnsi="Microsoft YaHei" w:eastAsia="Microsoft YaHei"/>
+          <w:rFonts w:ascii="SimSun" w:hAnsi="SimSun" w:eastAsia="SimSun"/>
           <w:b w:val="0"/>
         </w:rPr>
-        <w:t xml:space="preserve">，固定 seed=123 raw reward 为 </w:t>
+        <w:t xml:space="preserve">，固定 seed=3407 raw reward 为 </w:t>
       </w:r>
       <w:r>
         <w:rPr>
           <w:rFonts w:ascii="Consolas" w:hAnsi="Consolas" w:eastAsia="Consolas"/>
           <w:b w:val="0"/>
-          <w:color w:val="282828"/>
+          <w:color w:val="000000"/>
           <w:sz w:val="19"/>
         </w:rPr>
-        <w:t>6780.809</w:t>
+        <w:t>6770.456</w:t>
       </w:r>
       <w:r>
         <w:rPr>
-          <w:rFonts w:ascii="Microsoft YaHei" w:hAnsi="Microsoft YaHei" w:eastAsia="Microsoft YaHei"/>
+          <w:rFonts w:ascii="SimSun" w:hAnsi="SimSun" w:eastAsia="SimSun"/>
           <w:b w:val="0"/>
         </w:rPr>
         <w:t>。</w:t>
@@ -2018,7 +2018,7 @@
     <w:p>
       <w:r>
         <w:rPr>
-          <w:rFonts w:ascii="Microsoft YaHei" w:hAnsi="Microsoft YaHei" w:eastAsia="Microsoft YaHei"/>
+          <w:rFonts w:ascii="SimSun" w:hAnsi="SimSun" w:eastAsia="SimSun"/>
           <w:b w:val="0"/>
         </w:rPr>
         <w:t>建议提交以下内容：</w:t>
@@ -2031,7 +2031,7 @@
       </w:pPr>
       <w:r>
         <w:rPr>
-          <w:rFonts w:ascii="Microsoft YaHei" w:hAnsi="Microsoft YaHei" w:eastAsia="Microsoft YaHei"/>
+          <w:rFonts w:ascii="SimSun" w:hAnsi="SimSun" w:eastAsia="SimSun"/>
           <w:b w:val="0"/>
         </w:rPr>
         <w:t>完整源代码。</w:t>
@@ -2045,14 +2045,14 @@
         <w:rPr>
           <w:rFonts w:ascii="Consolas" w:hAnsi="Consolas" w:eastAsia="Consolas"/>
           <w:b w:val="0"/>
-          <w:color w:val="282828"/>
+          <w:color w:val="000000"/>
           <w:sz w:val="19"/>
         </w:rPr>
         <w:t>requirements.txt</w:t>
       </w:r>
       <w:r>
         <w:rPr>
-          <w:rFonts w:ascii="Microsoft YaHei" w:hAnsi="Microsoft YaHei" w:eastAsia="Microsoft YaHei"/>
+          <w:rFonts w:ascii="SimSun" w:hAnsi="SimSun" w:eastAsia="SimSun"/>
           <w:b w:val="0"/>
         </w:rPr>
         <w:t>。</w:t>
@@ -2064,7 +2064,7 @@
       </w:pPr>
       <w:r>
         <w:rPr>
-          <w:rFonts w:ascii="Microsoft YaHei" w:hAnsi="Microsoft YaHei" w:eastAsia="Microsoft YaHei"/>
+          <w:rFonts w:ascii="SimSun" w:hAnsi="SimSun" w:eastAsia="SimSun"/>
           <w:b w:val="0"/>
         </w:rPr>
         <w:t>本报告。</w:t>
@@ -2076,7 +2076,7 @@
       </w:pPr>
       <w:r>
         <w:rPr>
-          <w:rFonts w:ascii="Microsoft YaHei" w:hAnsi="Microsoft YaHei" w:eastAsia="Microsoft YaHei"/>
+          <w:rFonts w:ascii="SimSun" w:hAnsi="SimSun" w:eastAsia="SimSun"/>
           <w:b w:val="0"/>
         </w:rPr>
         <w:t xml:space="preserve">视频说明文档 </w:t>
@@ -2085,14 +2085,14 @@
         <w:rPr>
           <w:rFonts w:ascii="Consolas" w:hAnsi="Consolas" w:eastAsia="Consolas"/>
           <w:b w:val="0"/>
-          <w:color w:val="282828"/>
+          <w:color w:val="000000"/>
           <w:sz w:val="19"/>
         </w:rPr>
         <w:t>docs/video_explanation.md</w:t>
       </w:r>
       <w:r>
         <w:rPr>
-          <w:rFonts w:ascii="Microsoft YaHei" w:hAnsi="Microsoft YaHei" w:eastAsia="Microsoft YaHei"/>
+          <w:rFonts w:ascii="SimSun" w:hAnsi="SimSun" w:eastAsia="SimSun"/>
           <w:b w:val="0"/>
         </w:rPr>
         <w:t>。</w:t>
@@ -2104,7 +2104,7 @@
       </w:pPr>
       <w:r>
         <w:rPr>
-          <w:rFonts w:ascii="Microsoft YaHei" w:hAnsi="Microsoft YaHei" w:eastAsia="Microsoft YaHei"/>
+          <w:rFonts w:ascii="SimSun" w:hAnsi="SimSun" w:eastAsia="SimSun"/>
           <w:b w:val="0"/>
         </w:rPr>
         <w:t>最终 policy 文件：</w:t>
@@ -2115,7 +2115,7 @@
         <w:rPr>
           <w:rFonts w:ascii="Consolas" w:hAnsi="Consolas" w:eastAsia="Consolas"/>
           <w:b w:val="0"/>
-          <w:color w:val="282828"/>
+          <w:color w:val="000000"/>
           <w:sz w:val="19"/>
         </w:rPr>
         <w:t>runs/local_sac_cpu_5m_seed3407/models/checkpoint_model_5000000_steps.zip</w:t>
@@ -2127,7 +2127,7 @@
       </w:pPr>
       <w:r>
         <w:rPr>
-          <w:rFonts w:ascii="Microsoft YaHei" w:hAnsi="Microsoft YaHei" w:eastAsia="Microsoft YaHei"/>
+          <w:rFonts w:ascii="SimSun" w:hAnsi="SimSun" w:eastAsia="SimSun"/>
           <w:b w:val="0"/>
         </w:rPr>
         <w:t>checkpoint 初筛结果 CSV/JSON。</w:t>
@@ -2139,7 +2139,7 @@
       </w:pPr>
       <w:r>
         <w:rPr>
-          <w:rFonts w:ascii="Microsoft YaHei" w:hAnsi="Microsoft YaHei" w:eastAsia="Microsoft YaHei"/>
+          <w:rFonts w:ascii="SimSun" w:hAnsi="SimSun" w:eastAsia="SimSun"/>
           <w:b w:val="0"/>
         </w:rPr>
         <w:t>正式 10-seed 评估结果 CSV/JSON。</w:t>
@@ -2151,7 +2151,7 @@
       </w:pPr>
       <w:r>
         <w:rPr>
-          <w:rFonts w:ascii="Microsoft YaHei" w:hAnsi="Microsoft YaHei" w:eastAsia="Microsoft YaHei"/>
+          <w:rFonts w:ascii="SimSun" w:hAnsi="SimSun" w:eastAsia="SimSun"/>
           <w:b w:val="0"/>
         </w:rPr>
         <w:t>训练开始、中期、尾声截图或分段录屏。</w:t>
@@ -2163,7 +2163,7 @@
       </w:pPr>
       <w:r>
         <w:rPr>
-          <w:rFonts w:ascii="Microsoft YaHei" w:hAnsi="Microsoft YaHei" w:eastAsia="Microsoft YaHei"/>
+          <w:rFonts w:ascii="SimSun" w:hAnsi="SimSun" w:eastAsia="SimSun"/>
           <w:b w:val="0"/>
         </w:rPr>
         <w:t>最终 policy 行走视频。</w:t>
@@ -2185,7 +2185,7 @@
       </w:pPr>
       <w:r>
         <w:rPr>
-          <w:rFonts w:ascii="Microsoft YaHei" w:hAnsi="Microsoft YaHei" w:eastAsia="Microsoft YaHei"/>
+          <w:rFonts w:ascii="SimSun" w:hAnsi="SimSun" w:eastAsia="SimSun"/>
           <w:b w:val="0"/>
         </w:rPr>
         <w:t>Gymnasium Humanoid-v5 documentation: https://gymnasium.farama.org/environments/mujoco/humanoid/</w:t>
@@ -2197,7 +2197,7 @@
       </w:pPr>
       <w:r>
         <w:rPr>
-          <w:rFonts w:ascii="Microsoft YaHei" w:hAnsi="Microsoft YaHei" w:eastAsia="Microsoft YaHei"/>
+          <w:rFonts w:ascii="SimSun" w:hAnsi="SimSun" w:eastAsia="SimSun"/>
           <w:b w:val="0"/>
         </w:rPr>
         <w:t>Soft Actor-Critic: https://arxiv.org/abs/1801.01290</w:t>
@@ -2209,7 +2209,7 @@
       </w:pPr>
       <w:r>
         <w:rPr>
-          <w:rFonts w:ascii="Microsoft YaHei" w:hAnsi="Microsoft YaHei" w:eastAsia="Microsoft YaHei"/>
+          <w:rFonts w:ascii="SimSun" w:hAnsi="SimSun" w:eastAsia="SimSun"/>
           <w:b w:val="0"/>
         </w:rPr>
         <w:t>Soft Actor-Critic Algorithms and Applications: https://arxiv.org/abs/1812.05905</w:t>
@@ -2221,7 +2221,7 @@
       </w:pPr>
       <w:r>
         <w:rPr>
-          <w:rFonts w:ascii="Microsoft YaHei" w:hAnsi="Microsoft YaHei" w:eastAsia="Microsoft YaHei"/>
+          <w:rFonts w:ascii="SimSun" w:hAnsi="SimSun" w:eastAsia="SimSun"/>
           <w:b w:val="0"/>
         </w:rPr>
         <w:t>Proximal Policy Optimization Algorithms: https://arxiv.org/abs/1707.06347</w:t>
@@ -2233,7 +2233,7 @@
       </w:pPr>
       <w:r>
         <w:rPr>
-          <w:rFonts w:ascii="Microsoft YaHei" w:hAnsi="Microsoft YaHei" w:eastAsia="Microsoft YaHei"/>
+          <w:rFonts w:ascii="SimSun" w:hAnsi="SimSun" w:eastAsia="SimSun"/>
           <w:b w:val="0"/>
         </w:rPr>
         <w:t>Twin Delayed DDPG: https://arxiv.org/abs/1802.09477</w:t>
@@ -2245,7 +2245,7 @@
       </w:pPr>
       <w:r>
         <w:rPr>
-          <w:rFonts w:ascii="Microsoft YaHei" w:hAnsi="Microsoft YaHei" w:eastAsia="Microsoft YaHei"/>
+          <w:rFonts w:ascii="SimSun" w:hAnsi="SimSun" w:eastAsia="SimSun"/>
           <w:b w:val="0"/>
         </w:rPr>
         <w:t>Stable-Baselines3 documentation: https://stable-baselines3.readthedocs.io/</w:t>
@@ -2273,7 +2273,7 @@
           <w:p>
             <w:r>
               <w:rPr>
-                <w:rFonts w:ascii="Microsoft YaHei" w:hAnsi="Microsoft YaHei" w:eastAsia="Microsoft YaHei"/>
+                <w:rFonts w:ascii="SimSun" w:hAnsi="SimSun" w:eastAsia="SimSun"/>
                 <w:b/>
               </w:rPr>
               <w:t>最终 checkpoint</w:t>
@@ -2288,7 +2288,7 @@
           <w:p>
             <w:r>
               <w:rPr>
-                <w:rFonts w:ascii="Microsoft YaHei" w:hAnsi="Microsoft YaHei" w:eastAsia="Microsoft YaHei"/>
+                <w:rFonts w:ascii="SimSun" w:hAnsi="SimSun" w:eastAsia="SimSun"/>
                 <w:b/>
               </w:rPr>
               <w:t>10-seed mean reward</w:t>
@@ -2303,10 +2303,10 @@
           <w:p>
             <w:r>
               <w:rPr>
-                <w:rFonts w:ascii="Microsoft YaHei" w:hAnsi="Microsoft YaHei" w:eastAsia="Microsoft YaHei"/>
+                <w:rFonts w:ascii="SimSun" w:hAnsi="SimSun" w:eastAsia="SimSun"/>
                 <w:b/>
               </w:rPr>
-              <w:t>seed=123 reward</w:t>
+              <w:t>seed=3407 reward</w:t>
             </w:r>
           </w:p>
         </w:tc>
@@ -2318,7 +2318,7 @@
           <w:p>
             <w:r>
               <w:rPr>
-                <w:rFonts w:ascii="Microsoft YaHei" w:hAnsi="Microsoft YaHei" w:eastAsia="Microsoft YaHei"/>
+                <w:rFonts w:ascii="SimSun" w:hAnsi="SimSun" w:eastAsia="SimSun"/>
                 <w:b/>
               </w:rPr>
               <w:t>episode length</w:t>
@@ -2334,7 +2334,7 @@
           <w:p>
             <w:r>
               <w:rPr>
-                <w:rFonts w:ascii="Microsoft YaHei" w:hAnsi="Microsoft YaHei" w:eastAsia="Microsoft YaHei"/>
+                <w:rFonts w:ascii="SimSun" w:hAnsi="SimSun" w:eastAsia="SimSun"/>
               </w:rPr>
               <w:t>5,000,000 steps</w:t>
             </w:r>
@@ -2347,7 +2347,7 @@
           <w:p>
             <w:r>
               <w:rPr>
-                <w:rFonts w:ascii="Microsoft YaHei" w:hAnsi="Microsoft YaHei" w:eastAsia="Microsoft YaHei"/>
+                <w:rFonts w:ascii="SimSun" w:hAnsi="SimSun" w:eastAsia="SimSun"/>
               </w:rPr>
               <w:t>6780.676</w:t>
             </w:r>
@@ -2360,9 +2360,9 @@
           <w:p>
             <w:r>
               <w:rPr>
-                <w:rFonts w:ascii="Microsoft YaHei" w:hAnsi="Microsoft YaHei" w:eastAsia="Microsoft YaHei"/>
+                <w:rFonts w:ascii="SimSun" w:hAnsi="SimSun" w:eastAsia="SimSun"/>
               </w:rPr>
-              <w:t>6780.809</w:t>
+              <w:t>6770.456</w:t>
             </w:r>
           </w:p>
         </w:tc>
@@ -2373,7 +2373,7 @@
           <w:p>
             <w:r>
               <w:rPr>
-                <w:rFonts w:ascii="Microsoft YaHei" w:hAnsi="Microsoft YaHei" w:eastAsia="Microsoft YaHei"/>
+                <w:rFonts w:ascii="SimSun" w:hAnsi="SimSun" w:eastAsia="SimSun"/>
               </w:rPr>
               <w:t>1000</w:t>
             </w:r>
@@ -2758,7 +2758,7 @@
       <w:spacing w:after="100" w:line="276" w:lineRule="auto"/>
     </w:pPr>
     <w:rPr>
-      <w:rFonts w:ascii="Microsoft YaHei" w:hAnsi="Microsoft YaHei" w:eastAsia="Microsoft YaHei"/>
+      <w:rFonts w:ascii="SimSun" w:hAnsi="SimSun" w:eastAsia="SimSun"/>
       <w:sz w:val="21"/>
     </w:rPr>
   </w:style>
@@ -2821,10 +2821,10 @@
       <w:outlineLvl w:val="0"/>
     </w:pPr>
     <w:rPr>
-      <w:rFonts w:asciiTheme="majorHAnsi" w:eastAsiaTheme="majorEastAsia" w:hAnsiTheme="majorHAnsi" w:cstheme="majorBidi" w:ascii="Microsoft YaHei" w:hAnsi="Microsoft YaHei" w:eastAsia="Microsoft YaHei"/>
+      <w:rFonts w:asciiTheme="majorHAnsi" w:eastAsiaTheme="majorEastAsia" w:hAnsiTheme="majorHAnsi" w:cstheme="majorBidi" w:ascii="SimSun" w:hAnsi="SimSun" w:eastAsia="SimSun"/>
       <w:b/>
       <w:bCs/>
-      <w:color w:val="1F4E79"/>
+      <w:color w:val="000000"/>
       <w:sz w:val="32"/>
       <w:szCs w:val="28"/>
     </w:rPr>
@@ -2845,10 +2845,10 @@
       <w:outlineLvl w:val="1"/>
     </w:pPr>
     <w:rPr>
-      <w:rFonts w:asciiTheme="majorHAnsi" w:eastAsiaTheme="majorEastAsia" w:hAnsiTheme="majorHAnsi" w:cstheme="majorBidi" w:ascii="Microsoft YaHei" w:hAnsi="Microsoft YaHei" w:eastAsia="Microsoft YaHei"/>
+      <w:rFonts w:asciiTheme="majorHAnsi" w:eastAsiaTheme="majorEastAsia" w:hAnsiTheme="majorHAnsi" w:cstheme="majorBidi" w:ascii="SimSun" w:hAnsi="SimSun" w:eastAsia="SimSun"/>
       <w:b/>
       <w:bCs/>
-      <w:color w:val="2E74B5"/>
+      <w:color w:val="000000"/>
       <w:sz w:val="26"/>
       <w:szCs w:val="26"/>
     </w:rPr>
@@ -2869,10 +2869,10 @@
       <w:outlineLvl w:val="2"/>
     </w:pPr>
     <w:rPr>
-      <w:rFonts w:asciiTheme="majorHAnsi" w:eastAsiaTheme="majorEastAsia" w:hAnsiTheme="majorHAnsi" w:cstheme="majorBidi" w:ascii="Microsoft YaHei" w:hAnsi="Microsoft YaHei" w:eastAsia="Microsoft YaHei"/>
+      <w:rFonts w:asciiTheme="majorHAnsi" w:eastAsiaTheme="majorEastAsia" w:hAnsiTheme="majorHAnsi" w:cstheme="majorBidi" w:ascii="SimSun" w:hAnsi="SimSun" w:eastAsia="SimSun"/>
       <w:b/>
       <w:bCs/>
-      <w:color w:val="1F4E79"/>
+      <w:color w:val="000000"/>
       <w:sz w:val="23"/>
     </w:rPr>
   </w:style>

</xml_diff>